<commit_message>
Työkirja: Matin teksti alkuun sanasta sanaan + sivutuskorjaus (keepNext/cantSplit)
- Alun sisältö Matin sanelemana: kaksi johdantokappaletta, Nimi tai oma tunniste
  omana osionaan selitteineen, Oma reittini -kenttien uudet sanamuodot.
  Tietosuojalaatikko poistettu Matin version mukaisesti.
- Sivutus: keepNext kickereihin/otsikoihin/kenttäotsikoihin (eivät jää yksin
  sivun loppuun), cantSplit vastauslaatikoihin ja taulukkoriveihin (eivät
  katkea sivunvaihdossa). 54+47 esiintymää XML:ssä.
- docx devDependencyksi (skripti ajettavissa suoraan repossa: node tee_tyokirja_docx.js).
- Visuaalinen varmistus selainpohjaisella OOXML-renderöijällä: laatikot ja
  taulukot täysleveitä, osiot oikein. OOXML-validointi PASSED.
</commit_message>
<xml_diff>
--- a/downloads/ai-perusteet-tyokirja.docx
+++ b/downloads/ai-perusteet-tyokirja.docx
@@ -49,61 +49,66 @@
           <w:sz w:val="21"/>
           <w:szCs w:val="21"/>
         </w:rPr>
-        <w:t xml:space="preserve">Tämä työkirja on henkilökohtainen työjälkesi: tallenna tänne promptisi, kokeiden tulokset, lähteet ja tekemäsi korjaukset, koska kurssisivusto ei tallenna niitä puolestasi. Voit täyttää tiedostoa tekstieditorissa tai tekstinkäsittelyohjelmassa ja tulostaa sen PDF:ksi.</w:t>
-      </w:r>
-    </w:p>
-    <w:tbl>
-      <w:tblPr>
-        <w:tblW w:type="dxa" w:w="9026"/>
-        <w:tblBorders>
-          <w:top w:val="none"/>
-          <w:left w:val="single" w:color="3B5BDB" w:sz="24"/>
-          <w:bottom w:val="none"/>
-          <w:right w:val="none"/>
-          <w:insideH w:val="none"/>
-          <w:insideV w:val="none"/>
-        </w:tblBorders>
-        <w:tblLayout w:type="fixed"/>
-      </w:tblPr>
-      <w:tblGrid>
-        <w:gridCol w:w="9026"/>
-      </w:tblGrid>
-      <w:tr>
-        <w:tc>
-          <w:tcPr>
-            <w:tcW w:type="dxa" w:w="9026"/>
-            <w:shd w:fill="F4F6FB" w:val="clear"/>
-            <w:tcMar>
-              <w:top w:type="dxa" w:w="140"/>
-              <w:left w:type="dxa" w:w="200"/>
-              <w:bottom w:type="dxa" w:w="140"/>
-              <w:right w:type="dxa" w:w="200"/>
-            </w:tcMar>
-          </w:tcPr>
-          <w:p>
-            <w:pPr>
-              <w:spacing w:after="0" w:line="276"/>
-            </w:pPr>
-            <w:r>
-              <w:rPr>
-                <w:rFonts w:ascii="Helvetica Neue" w:cs="Helvetica Neue" w:eastAsia="Helvetica Neue" w:hAnsi="Helvetica Neue"/>
-                <w:color w:val="3A4253"/>
-                <w:sz w:val="20"/>
-                <w:szCs w:val="20"/>
-              </w:rPr>
-              <w:t xml:space="preserve">Älä tallenna työkirjaan muiden ihmisten henkilötietoja tai luottamuksellista aineistoa — sama periaate, jonka opit kurssilla tekoälypalveluiden käytöstä, koskee myös omia muistiinpanojasi.</w:t>
-            </w:r>
-          </w:p>
-        </w:tc>
-      </w:tr>
-    </w:tbl>
-    <w:p>
-      <w:pPr>
-        <w:spacing w:after="160"/>
-      </w:pPr>
-    </w:p>
-    <w:p>
-      <w:pPr>
+        <w:t xml:space="preserve">Tämä työkirja on kurssin henkilökohtainen työdokumenttisi. Tallenna siihen promptisi, kokeilujesi tulokset, käyttämäsi lähteet ja tekemäsi korjaukset, sillä kurssisivusto ei säilytä niitä puolestasi.</w:t>
+      </w:r>
+    </w:p>
+    <w:p>
+      <w:pPr>
+        <w:spacing w:after="120" w:line="288"/>
+      </w:pPr>
+      <w:r>
+        <w:rPr>
+          <w:rFonts w:ascii="Helvetica Neue" w:cs="Helvetica Neue" w:eastAsia="Helvetica Neue" w:hAnsi="Helvetica Neue"/>
+          <w:i w:val="false"/>
+          <w:iCs w:val="false"/>
+          <w:color w:val="3A4253"/>
+          <w:sz w:val="21"/>
+          <w:szCs w:val="21"/>
+        </w:rPr>
+        <w:t xml:space="preserve">Voit täyttää työkirjaa millä tahansa tekstieditorilla tai tekstinkäsittelyohjelmalla ja tallentaa sen lopuksi PDF-muotoon.</w:t>
+      </w:r>
+    </w:p>
+    <w:p>
+      <w:pPr>
+        <w:pStyle w:val="Heading1"/>
+        <w:keepNext/>
+        <w:pBdr>
+          <w:left w:val="single" w:color="3B5BDB" w:sz="24" w:space="12"/>
+        </w:pBdr>
+        <w:spacing w:after="60" w:before="320"/>
+      </w:pPr>
+      <w:r>
+        <w:rPr>
+          <w:rFonts w:ascii="Helvetica Neue" w:cs="Helvetica Neue" w:eastAsia="Helvetica Neue" w:hAnsi="Helvetica Neue"/>
+          <w:b/>
+          <w:bCs/>
+          <w:color w:val="1B2336"/>
+          <w:sz w:val="30"/>
+          <w:szCs w:val="30"/>
+        </w:rPr>
+        <w:t xml:space="preserve">Nimi tai oma tunniste</w:t>
+      </w:r>
+    </w:p>
+    <w:p>
+      <w:pPr>
+        <w:spacing w:after="120" w:line="288"/>
+      </w:pPr>
+      <w:r>
+        <w:rPr>
+          <w:rFonts w:ascii="Helvetica Neue" w:cs="Helvetica Neue" w:eastAsia="Helvetica Neue" w:hAnsi="Helvetica Neue"/>
+          <w:i w:val="false"/>
+          <w:iCs w:val="false"/>
+          <w:color w:val="3A4253"/>
+          <w:sz w:val="21"/>
+          <w:szCs w:val="21"/>
+        </w:rPr>
+        <w:t xml:space="preserve">Jos palautat työkirjan opettajalle tai oppilaitokselle, kirjoita tähän nimesi tai muu sovittu tunniste. Jos suoritat kurssin itsenäisesti, voit jättää kohdan tyhjäksi.</w:t>
+      </w:r>
+    </w:p>
+    <w:p>
+      <w:pPr>
+        <w:keepNext/>
+        <w:keepLines/>
         <w:spacing w:after="80" w:before="160"/>
       </w:pPr>
       <w:r>
@@ -115,7 +120,7 @@
           <w:sz w:val="21"/>
           <w:szCs w:val="21"/>
         </w:rPr>
-        <w:t xml:space="preserve">Nimi tai oma tunniste:</w:t>
+        <w:t xml:space="preserve">Nimi tai tunniste:</w:t>
       </w:r>
     </w:p>
     <w:tbl>
@@ -135,6 +140,9 @@
         <w:gridCol w:w="9026"/>
       </w:tblGrid>
       <w:tr>
+        <w:trPr>
+          <w:cantSplit/>
+        </w:trPr>
         <w:tc>
           <w:tcPr>
             <w:tcW w:type="dxa" w:w="9026"/>
@@ -168,23 +176,8 @@
     </w:p>
     <w:p>
       <w:pPr>
-        <w:spacing w:after="160" w:line="276"/>
-      </w:pPr>
-      <w:r>
-        <w:rPr>
-          <w:rFonts w:ascii="Helvetica Neue" w:cs="Helvetica Neue" w:eastAsia="Helvetica Neue" w:hAnsi="Helvetica Neue"/>
-          <w:i/>
-          <w:iCs/>
-          <w:color w:val="5A6478"/>
-          <w:sz w:val="19"/>
-          <w:szCs w:val="19"/>
-        </w:rPr>
-        <w:t xml:space="preserve">Jos palautat työkirjan opettajalle tai oppilaitokselle, nimestä näkyy, kenen työ on kyseessä. Itsenäisenä opiskelijana voit jättää kohdan tyhjäksi.</w:t>
-      </w:r>
-    </w:p>
-    <w:p>
-      <w:pPr>
         <w:pStyle w:val="Heading1"/>
+        <w:keepNext/>
         <w:pBdr>
           <w:left w:val="single" w:color="3B5BDB" w:sz="24" w:space="12"/>
         </w:pBdr>
@@ -215,11 +208,13 @@
           <w:sz w:val="21"/>
           <w:szCs w:val="21"/>
         </w:rPr>
-        <w:t xml:space="preserve">Kurssin tehtävissä valitset itse, millaisiin tilanteisiin sovellat oppimaasi. Kirjaa valintasi tähän kerran, niin sinun ei tarvitse miettiä niitä jokaisen tehtävän kohdalla uudelleen — ja lukija näkee yhdellä silmäyksellä, miten teit kurssin.</w:t>
-      </w:r>
-    </w:p>
-    <w:p>
-      <w:pPr>
+        <w:t xml:space="preserve">Kurssin tehtävissä sovellat opittuja asioita itse valitsemaasi tilanteeseen. Tee valinnat tähän kerran kurssin alussa. Näin voit käyttää samaa lähtökohtaa kaikissa tehtävissä, ja samalla lukija näkee, millaisessa ympäristössä olet tehnyt harjoitukset.</w:t>
+      </w:r>
+    </w:p>
+    <w:p>
+      <w:pPr>
+        <w:keepNext/>
+        <w:keepLines/>
         <w:spacing w:after="80" w:before="160"/>
       </w:pPr>
       <w:r>
@@ -231,7 +226,7 @@
           <w:sz w:val="21"/>
           <w:szCs w:val="21"/>
         </w:rPr>
-        <w:t xml:space="preserve">Konteksti, johon sovellan oppimaani (arki tai harrastus / opiskelu / työelämän rooliskenaario):</w:t>
+        <w:t xml:space="preserve">Sovellan tehtäviä seuraavaan ympäristöön (arki tai harrastus / opiskelu / työelämän rooliskenaario):</w:t>
       </w:r>
     </w:p>
     <w:tbl>
@@ -251,6 +246,9 @@
         <w:gridCol w:w="9026"/>
       </w:tblGrid>
       <w:tr>
+        <w:trPr>
+          <w:cantSplit/>
+        </w:trPr>
         <w:tc>
           <w:tcPr>
             <w:tcW w:type="dxa" w:w="9026"/>
@@ -284,6 +282,8 @@
     </w:p>
     <w:p>
       <w:pPr>
+        <w:keepNext/>
+        <w:keepLines/>
         <w:spacing w:after="80" w:before="160"/>
       </w:pPr>
       <w:r>
@@ -295,7 +295,7 @@
           <w:sz w:val="21"/>
           <w:szCs w:val="21"/>
         </w:rPr>
-        <w:t xml:space="preserve">Työkalu, jolla teen kokeet (saatavilla oleva chat / annettu esimerkkitulos / dokumentoitu kuivaharjoittelu ilman tiliä):</w:t>
+        <w:t xml:space="preserve">Työkalu, jolla teen harjoitukset (esim. tekoälychat, annettu esimerkkitulos tai dokumentoitu kuivaharjoittelu):</w:t>
       </w:r>
     </w:p>
     <w:tbl>
@@ -315,6 +315,9 @@
         <w:gridCol w:w="9026"/>
       </w:tblGrid>
       <w:tr>
+        <w:trPr>
+          <w:cantSplit/>
+        </w:trPr>
         <w:tc>
           <w:tcPr>
             <w:tcW w:type="dxa" w:w="9026"/>
@@ -348,6 +351,8 @@
     </w:p>
     <w:p>
       <w:pPr>
+        <w:keepNext/>
+        <w:keepLines/>
         <w:spacing w:after="80" w:before="160"/>
       </w:pPr>
       <w:r>
@@ -359,7 +364,7 @@
           <w:sz w:val="21"/>
           <w:szCs w:val="21"/>
         </w:rPr>
-        <w:t xml:space="preserve">Minne tallennan tämän työkirjan ja tuotokseni:</w:t>
+        <w:t xml:space="preserve">Minne tallennan tämän työkirjan ja muut kurssin tuotokset:</w:t>
       </w:r>
     </w:p>
     <w:tbl>
@@ -379,6 +384,9 @@
         <w:gridCol w:w="9026"/>
       </w:tblGrid>
       <w:tr>
+        <w:trPr>
+          <w:cantSplit/>
+        </w:trPr>
         <w:tc>
           <w:tcPr>
             <w:tcW w:type="dxa" w:w="9026"/>
@@ -412,6 +420,7 @@
     </w:p>
     <w:p>
       <w:pPr>
+        <w:keepNext/>
         <w:spacing w:after="40" w:before="60"/>
       </w:pPr>
       <w:r>
@@ -428,6 +437,7 @@
     <w:p>
       <w:pPr>
         <w:pStyle w:val="Heading1"/>
+        <w:keepNext/>
         <w:pBdr>
           <w:left w:val="single" w:color="3B5BDB" w:sz="24" w:space="12"/>
         </w:pBdr>
@@ -448,6 +458,7 @@
     <w:p>
       <w:pPr>
         <w:pStyle w:val="Heading2"/>
+        <w:keepNext/>
         <w:spacing w:after="40" w:before="240"/>
       </w:pPr>
       <w:r>
@@ -464,6 +475,8 @@
     </w:p>
     <w:p>
       <w:pPr>
+        <w:keepNext/>
+        <w:keepLines/>
         <w:spacing w:after="80" w:before="160"/>
       </w:pPr>
       <w:r>
@@ -495,6 +508,9 @@
         <w:gridCol w:w="9026"/>
       </w:tblGrid>
       <w:tr>
+        <w:trPr>
+          <w:cantSplit/>
+        </w:trPr>
         <w:tc>
           <w:tcPr>
             <w:tcW w:type="dxa" w:w="9026"/>
@@ -541,6 +557,8 @@
     </w:p>
     <w:p>
       <w:pPr>
+        <w:keepNext/>
+        <w:keepLines/>
         <w:spacing w:after="80" w:before="160"/>
       </w:pPr>
       <w:r>
@@ -572,6 +590,9 @@
         <w:gridCol w:w="9026"/>
       </w:tblGrid>
       <w:tr>
+        <w:trPr>
+          <w:cantSplit/>
+        </w:trPr>
         <w:tc>
           <w:tcPr>
             <w:tcW w:type="dxa" w:w="9026"/>
@@ -605,6 +626,8 @@
     </w:p>
     <w:p>
       <w:pPr>
+        <w:keepNext/>
+        <w:keepLines/>
         <w:spacing w:after="80" w:before="160"/>
       </w:pPr>
       <w:r>
@@ -636,6 +659,9 @@
         <w:gridCol w:w="9026"/>
       </w:tblGrid>
       <w:tr>
+        <w:trPr>
+          <w:cantSplit/>
+        </w:trPr>
         <w:tc>
           <w:tcPr>
             <w:tcW w:type="dxa" w:w="9026"/>
@@ -669,6 +695,8 @@
     </w:p>
     <w:p>
       <w:pPr>
+        <w:keepNext/>
+        <w:keepLines/>
         <w:spacing w:after="80" w:before="160"/>
       </w:pPr>
       <w:r>
@@ -700,6 +728,9 @@
         <w:gridCol w:w="9026"/>
       </w:tblGrid>
       <w:tr>
+        <w:trPr>
+          <w:cantSplit/>
+        </w:trPr>
         <w:tc>
           <w:tcPr>
             <w:tcW w:type="dxa" w:w="9026"/>
@@ -733,6 +764,8 @@
     </w:p>
     <w:p>
       <w:pPr>
+        <w:keepNext/>
+        <w:keepLines/>
         <w:spacing w:after="80" w:before="160"/>
       </w:pPr>
       <w:r>
@@ -764,6 +797,9 @@
         <w:gridCol w:w="9026"/>
       </w:tblGrid>
       <w:tr>
+        <w:trPr>
+          <w:cantSplit/>
+        </w:trPr>
         <w:tc>
           <w:tcPr>
             <w:tcW w:type="dxa" w:w="9026"/>
@@ -811,6 +847,7 @@
     <w:p>
       <w:pPr>
         <w:pStyle w:val="Heading2"/>
+        <w:keepNext/>
         <w:spacing w:after="40" w:before="240"/>
       </w:pPr>
       <w:r>
@@ -827,6 +864,8 @@
     </w:p>
     <w:p>
       <w:pPr>
+        <w:keepNext/>
+        <w:keepLines/>
         <w:spacing w:after="80" w:before="160"/>
       </w:pPr>
       <w:r>
@@ -858,6 +897,9 @@
         <w:gridCol w:w="9026"/>
       </w:tblGrid>
       <w:tr>
+        <w:trPr>
+          <w:cantSplit/>
+        </w:trPr>
         <w:tc>
           <w:tcPr>
             <w:tcW w:type="dxa" w:w="9026"/>
@@ -891,6 +933,8 @@
     </w:p>
     <w:p>
       <w:pPr>
+        <w:keepNext/>
+        <w:keepLines/>
         <w:spacing w:after="80" w:before="160"/>
       </w:pPr>
       <w:r>
@@ -922,6 +966,9 @@
         <w:gridCol w:w="9026"/>
       </w:tblGrid>
       <w:tr>
+        <w:trPr>
+          <w:cantSplit/>
+        </w:trPr>
         <w:tc>
           <w:tcPr>
             <w:tcW w:type="dxa" w:w="9026"/>
@@ -955,6 +1002,8 @@
     </w:p>
     <w:p>
       <w:pPr>
+        <w:keepNext/>
+        <w:keepLines/>
         <w:spacing w:after="80" w:before="160"/>
       </w:pPr>
       <w:r>
@@ -986,6 +1035,9 @@
         <w:gridCol w:w="9026"/>
       </w:tblGrid>
       <w:tr>
+        <w:trPr>
+          <w:cantSplit/>
+        </w:trPr>
         <w:tc>
           <w:tcPr>
             <w:tcW w:type="dxa" w:w="9026"/>
@@ -1019,6 +1071,8 @@
     </w:p>
     <w:p>
       <w:pPr>
+        <w:keepNext/>
+        <w:keepLines/>
         <w:spacing w:after="80" w:before="160"/>
       </w:pPr>
       <w:r>
@@ -1050,6 +1104,9 @@
         <w:gridCol w:w="9026"/>
       </w:tblGrid>
       <w:tr>
+        <w:trPr>
+          <w:cantSplit/>
+        </w:trPr>
         <w:tc>
           <w:tcPr>
             <w:tcW w:type="dxa" w:w="9026"/>
@@ -1097,6 +1154,7 @@
     <w:p>
       <w:pPr>
         <w:pStyle w:val="Heading2"/>
+        <w:keepNext/>
         <w:spacing w:after="40" w:before="240"/>
       </w:pPr>
       <w:r>
@@ -1248,6 +1306,9 @@
         </w:tc>
       </w:tr>
       <w:tr>
+        <w:trPr>
+          <w:cantSplit/>
+        </w:trPr>
         <w:tc>
           <w:tcPr>
             <w:tcW w:type="dxa" w:w="2482"/>
@@ -1358,6 +1419,9 @@
         </w:tc>
       </w:tr>
       <w:tr>
+        <w:trPr>
+          <w:cantSplit/>
+        </w:trPr>
         <w:tc>
           <w:tcPr>
             <w:tcW w:type="dxa" w:w="2482"/>
@@ -1468,6 +1532,9 @@
         </w:tc>
       </w:tr>
       <w:tr>
+        <w:trPr>
+          <w:cantSplit/>
+        </w:trPr>
         <w:tc>
           <w:tcPr>
             <w:tcW w:type="dxa" w:w="2482"/>
@@ -1580,6 +1647,7 @@
     </w:tbl>
     <w:p>
       <w:pPr>
+        <w:keepNext/>
         <w:spacing w:after="40" w:before="60"/>
       </w:pPr>
       <w:r>
@@ -1596,6 +1664,7 @@
     <w:p>
       <w:pPr>
         <w:pStyle w:val="Heading1"/>
+        <w:keepNext/>
         <w:pBdr>
           <w:left w:val="single" w:color="8449B8" w:sz="24" w:space="12"/>
         </w:pBdr>
@@ -1615,6 +1684,8 @@
     </w:p>
     <w:p>
       <w:pPr>
+        <w:keepNext/>
+        <w:keepLines/>
         <w:spacing w:after="80" w:before="160"/>
       </w:pPr>
       <w:r>
@@ -1646,6 +1717,9 @@
         <w:gridCol w:w="9026"/>
       </w:tblGrid>
       <w:tr>
+        <w:trPr>
+          <w:cantSplit/>
+        </w:trPr>
         <w:tc>
           <w:tcPr>
             <w:tcW w:type="dxa" w:w="9026"/>
@@ -1679,6 +1753,8 @@
     </w:p>
     <w:p>
       <w:pPr>
+        <w:keepNext/>
+        <w:keepLines/>
         <w:spacing w:after="80" w:before="160"/>
       </w:pPr>
       <w:r>
@@ -1710,6 +1786,9 @@
         <w:gridCol w:w="9026"/>
       </w:tblGrid>
       <w:tr>
+        <w:trPr>
+          <w:cantSplit/>
+        </w:trPr>
         <w:tc>
           <w:tcPr>
             <w:tcW w:type="dxa" w:w="9026"/>
@@ -1743,6 +1822,8 @@
     </w:p>
     <w:p>
       <w:pPr>
+        <w:keepNext/>
+        <w:keepLines/>
         <w:spacing w:after="80" w:before="160"/>
       </w:pPr>
       <w:r>
@@ -1774,6 +1855,9 @@
         <w:gridCol w:w="9026"/>
       </w:tblGrid>
       <w:tr>
+        <w:trPr>
+          <w:cantSplit/>
+        </w:trPr>
         <w:tc>
           <w:tcPr>
             <w:tcW w:type="dxa" w:w="9026"/>
@@ -1807,6 +1891,8 @@
     </w:p>
     <w:p>
       <w:pPr>
+        <w:keepNext/>
+        <w:keepLines/>
         <w:spacing w:after="80" w:before="160"/>
       </w:pPr>
       <w:r>
@@ -1838,6 +1924,9 @@
         <w:gridCol w:w="9026"/>
       </w:tblGrid>
       <w:tr>
+        <w:trPr>
+          <w:cantSplit/>
+        </w:trPr>
         <w:tc>
           <w:tcPr>
             <w:tcW w:type="dxa" w:w="9026"/>
@@ -1871,6 +1960,8 @@
     </w:p>
     <w:p>
       <w:pPr>
+        <w:keepNext/>
+        <w:keepLines/>
         <w:spacing w:after="80" w:before="160"/>
       </w:pPr>
       <w:r>
@@ -1902,6 +1993,9 @@
         <w:gridCol w:w="9026"/>
       </w:tblGrid>
       <w:tr>
+        <w:trPr>
+          <w:cantSplit/>
+        </w:trPr>
         <w:tc>
           <w:tcPr>
             <w:tcW w:type="dxa" w:w="9026"/>
@@ -1948,6 +2042,8 @@
     </w:p>
     <w:p>
       <w:pPr>
+        <w:keepNext/>
+        <w:keepLines/>
         <w:spacing w:after="80" w:before="160"/>
       </w:pPr>
       <w:r>
@@ -1979,6 +2075,9 @@
         <w:gridCol w:w="9026"/>
       </w:tblGrid>
       <w:tr>
+        <w:trPr>
+          <w:cantSplit/>
+        </w:trPr>
         <w:tc>
           <w:tcPr>
             <w:tcW w:type="dxa" w:w="9026"/>
@@ -2012,6 +2111,8 @@
     </w:p>
     <w:p>
       <w:pPr>
+        <w:keepNext/>
+        <w:keepLines/>
         <w:spacing w:after="80" w:before="160"/>
       </w:pPr>
       <w:r>
@@ -2043,6 +2144,9 @@
         <w:gridCol w:w="9026"/>
       </w:tblGrid>
       <w:tr>
+        <w:trPr>
+          <w:cantSplit/>
+        </w:trPr>
         <w:tc>
           <w:tcPr>
             <w:tcW w:type="dxa" w:w="9026"/>
@@ -2089,6 +2193,8 @@
     </w:p>
     <w:p>
       <w:pPr>
+        <w:keepNext/>
+        <w:keepLines/>
         <w:spacing w:after="80" w:before="160"/>
       </w:pPr>
       <w:r>
@@ -2120,6 +2226,9 @@
         <w:gridCol w:w="9026"/>
       </w:tblGrid>
       <w:tr>
+        <w:trPr>
+          <w:cantSplit/>
+        </w:trPr>
         <w:tc>
           <w:tcPr>
             <w:tcW w:type="dxa" w:w="9026"/>
@@ -2153,6 +2262,8 @@
     </w:p>
     <w:p>
       <w:pPr>
+        <w:keepNext/>
+        <w:keepLines/>
         <w:spacing w:after="80" w:before="160"/>
       </w:pPr>
       <w:r>
@@ -2184,6 +2295,9 @@
         <w:gridCol w:w="9026"/>
       </w:tblGrid>
       <w:tr>
+        <w:trPr>
+          <w:cantSplit/>
+        </w:trPr>
         <w:tc>
           <w:tcPr>
             <w:tcW w:type="dxa" w:w="9026"/>
@@ -2231,6 +2345,7 @@
     <w:p>
       <w:pPr>
         <w:pStyle w:val="Heading1"/>
+        <w:keepNext/>
         <w:pBdr>
           <w:left w:val="single" w:color="8449B8" w:sz="24" w:space="12"/>
         </w:pBdr>
@@ -2250,6 +2365,8 @@
     </w:p>
     <w:p>
       <w:pPr>
+        <w:keepNext/>
+        <w:keepLines/>
         <w:spacing w:after="80" w:before="160"/>
       </w:pPr>
       <w:r>
@@ -2281,6 +2398,9 @@
         <w:gridCol w:w="9026"/>
       </w:tblGrid>
       <w:tr>
+        <w:trPr>
+          <w:cantSplit/>
+        </w:trPr>
         <w:tc>
           <w:tcPr>
             <w:tcW w:type="dxa" w:w="9026"/>
@@ -2314,6 +2434,8 @@
     </w:p>
     <w:p>
       <w:pPr>
+        <w:keepNext/>
+        <w:keepLines/>
         <w:spacing w:after="80" w:before="160"/>
       </w:pPr>
       <w:r>
@@ -2345,6 +2467,9 @@
         <w:gridCol w:w="9026"/>
       </w:tblGrid>
       <w:tr>
+        <w:trPr>
+          <w:cantSplit/>
+        </w:trPr>
         <w:tc>
           <w:tcPr>
             <w:tcW w:type="dxa" w:w="9026"/>
@@ -2404,6 +2529,8 @@
     </w:p>
     <w:p>
       <w:pPr>
+        <w:keepNext/>
+        <w:keepLines/>
         <w:spacing w:after="80" w:before="160"/>
       </w:pPr>
       <w:r>
@@ -2435,6 +2562,9 @@
         <w:gridCol w:w="9026"/>
       </w:tblGrid>
       <w:tr>
+        <w:trPr>
+          <w:cantSplit/>
+        </w:trPr>
         <w:tc>
           <w:tcPr>
             <w:tcW w:type="dxa" w:w="9026"/>
@@ -2468,6 +2598,8 @@
     </w:p>
     <w:p>
       <w:pPr>
+        <w:keepNext/>
+        <w:keepLines/>
         <w:spacing w:after="80" w:before="160"/>
       </w:pPr>
       <w:r>
@@ -2499,6 +2631,9 @@
         <w:gridCol w:w="9026"/>
       </w:tblGrid>
       <w:tr>
+        <w:trPr>
+          <w:cantSplit/>
+        </w:trPr>
         <w:tc>
           <w:tcPr>
             <w:tcW w:type="dxa" w:w="9026"/>
@@ -2532,6 +2667,8 @@
     </w:p>
     <w:p>
       <w:pPr>
+        <w:keepNext/>
+        <w:keepLines/>
         <w:spacing w:after="80" w:before="160"/>
       </w:pPr>
       <w:r>
@@ -2563,6 +2700,9 @@
         <w:gridCol w:w="9026"/>
       </w:tblGrid>
       <w:tr>
+        <w:trPr>
+          <w:cantSplit/>
+        </w:trPr>
         <w:tc>
           <w:tcPr>
             <w:tcW w:type="dxa" w:w="9026"/>
@@ -2596,6 +2736,8 @@
     </w:p>
     <w:p>
       <w:pPr>
+        <w:keepNext/>
+        <w:keepLines/>
         <w:spacing w:after="80" w:before="160"/>
       </w:pPr>
       <w:r>
@@ -2627,6 +2769,9 @@
         <w:gridCol w:w="9026"/>
       </w:tblGrid>
       <w:tr>
+        <w:trPr>
+          <w:cantSplit/>
+        </w:trPr>
         <w:tc>
           <w:tcPr>
             <w:tcW w:type="dxa" w:w="9026"/>
@@ -2660,6 +2805,8 @@
     </w:p>
     <w:p>
       <w:pPr>
+        <w:keepNext/>
+        <w:keepLines/>
         <w:spacing w:after="80" w:before="160"/>
       </w:pPr>
       <w:r>
@@ -2691,6 +2838,9 @@
         <w:gridCol w:w="9026"/>
       </w:tblGrid>
       <w:tr>
+        <w:trPr>
+          <w:cantSplit/>
+        </w:trPr>
         <w:tc>
           <w:tcPr>
             <w:tcW w:type="dxa" w:w="9026"/>
@@ -2737,6 +2887,8 @@
     </w:p>
     <w:p>
       <w:pPr>
+        <w:keepNext/>
+        <w:keepLines/>
         <w:spacing w:after="80" w:before="160"/>
       </w:pPr>
       <w:r>
@@ -2768,6 +2920,9 @@
         <w:gridCol w:w="9026"/>
       </w:tblGrid>
       <w:tr>
+        <w:trPr>
+          <w:cantSplit/>
+        </w:trPr>
         <w:tc>
           <w:tcPr>
             <w:tcW w:type="dxa" w:w="9026"/>
@@ -2801,6 +2956,7 @@
     </w:p>
     <w:p>
       <w:pPr>
+        <w:keepNext/>
         <w:spacing w:after="40" w:before="60"/>
       </w:pPr>
       <w:r>
@@ -2817,6 +2973,7 @@
     <w:p>
       <w:pPr>
         <w:pStyle w:val="Heading1"/>
+        <w:keepNext/>
         <w:pBdr>
           <w:left w:val="single" w:color="007A8A" w:sz="24" w:space="12"/>
         </w:pBdr>
@@ -2836,6 +2993,8 @@
     </w:p>
     <w:p>
       <w:pPr>
+        <w:keepNext/>
+        <w:keepLines/>
         <w:spacing w:after="80" w:before="160"/>
       </w:pPr>
       <w:r>
@@ -2867,6 +3026,9 @@
         <w:gridCol w:w="9026"/>
       </w:tblGrid>
       <w:tr>
+        <w:trPr>
+          <w:cantSplit/>
+        </w:trPr>
         <w:tc>
           <w:tcPr>
             <w:tcW w:type="dxa" w:w="9026"/>
@@ -2900,6 +3062,8 @@
     </w:p>
     <w:p>
       <w:pPr>
+        <w:keepNext/>
+        <w:keepLines/>
         <w:spacing w:after="80" w:before="160"/>
       </w:pPr>
       <w:r>
@@ -2931,6 +3095,9 @@
         <w:gridCol w:w="9026"/>
       </w:tblGrid>
       <w:tr>
+        <w:trPr>
+          <w:cantSplit/>
+        </w:trPr>
         <w:tc>
           <w:tcPr>
             <w:tcW w:type="dxa" w:w="9026"/>
@@ -2977,6 +3144,8 @@
     </w:p>
     <w:p>
       <w:pPr>
+        <w:keepNext/>
+        <w:keepLines/>
         <w:spacing w:after="80" w:before="160"/>
       </w:pPr>
       <w:r>
@@ -3008,6 +3177,9 @@
         <w:gridCol w:w="9026"/>
       </w:tblGrid>
       <w:tr>
+        <w:trPr>
+          <w:cantSplit/>
+        </w:trPr>
         <w:tc>
           <w:tcPr>
             <w:tcW w:type="dxa" w:w="9026"/>
@@ -3067,6 +3239,8 @@
     </w:p>
     <w:p>
       <w:pPr>
+        <w:keepNext/>
+        <w:keepLines/>
         <w:spacing w:after="80" w:before="160"/>
       </w:pPr>
       <w:r>
@@ -3098,6 +3272,9 @@
         <w:gridCol w:w="9026"/>
       </w:tblGrid>
       <w:tr>
+        <w:trPr>
+          <w:cantSplit/>
+        </w:trPr>
         <w:tc>
           <w:tcPr>
             <w:tcW w:type="dxa" w:w="9026"/>
@@ -3144,6 +3321,8 @@
     </w:p>
     <w:p>
       <w:pPr>
+        <w:keepNext/>
+        <w:keepLines/>
         <w:spacing w:after="80" w:before="160"/>
       </w:pPr>
       <w:r>
@@ -3175,6 +3354,9 @@
         <w:gridCol w:w="9026"/>
       </w:tblGrid>
       <w:tr>
+        <w:trPr>
+          <w:cantSplit/>
+        </w:trPr>
         <w:tc>
           <w:tcPr>
             <w:tcW w:type="dxa" w:w="9026"/>
@@ -3234,6 +3416,8 @@
     </w:p>
     <w:p>
       <w:pPr>
+        <w:keepNext/>
+        <w:keepLines/>
         <w:spacing w:after="80" w:before="160"/>
       </w:pPr>
       <w:r>
@@ -3265,6 +3449,9 @@
         <w:gridCol w:w="9026"/>
       </w:tblGrid>
       <w:tr>
+        <w:trPr>
+          <w:cantSplit/>
+        </w:trPr>
         <w:tc>
           <w:tcPr>
             <w:tcW w:type="dxa" w:w="9026"/>
@@ -3311,6 +3498,8 @@
     </w:p>
     <w:p>
       <w:pPr>
+        <w:keepNext/>
+        <w:keepLines/>
         <w:spacing w:after="80" w:before="160"/>
       </w:pPr>
       <w:r>
@@ -3342,6 +3531,9 @@
         <w:gridCol w:w="9026"/>
       </w:tblGrid>
       <w:tr>
+        <w:trPr>
+          <w:cantSplit/>
+        </w:trPr>
         <w:tc>
           <w:tcPr>
             <w:tcW w:type="dxa" w:w="9026"/>
@@ -3388,6 +3580,8 @@
     </w:p>
     <w:p>
       <w:pPr>
+        <w:keepNext/>
+        <w:keepLines/>
         <w:spacing w:after="80" w:before="160"/>
       </w:pPr>
       <w:r>
@@ -3419,6 +3613,9 @@
         <w:gridCol w:w="9026"/>
       </w:tblGrid>
       <w:tr>
+        <w:trPr>
+          <w:cantSplit/>
+        </w:trPr>
         <w:tc>
           <w:tcPr>
             <w:tcW w:type="dxa" w:w="9026"/>
@@ -3465,6 +3662,8 @@
     </w:p>
     <w:p>
       <w:pPr>
+        <w:keepNext/>
+        <w:keepLines/>
         <w:spacing w:after="80" w:before="160"/>
       </w:pPr>
       <w:r>
@@ -3496,6 +3695,9 @@
         <w:gridCol w:w="9026"/>
       </w:tblGrid>
       <w:tr>
+        <w:trPr>
+          <w:cantSplit/>
+        </w:trPr>
         <w:tc>
           <w:tcPr>
             <w:tcW w:type="dxa" w:w="9026"/>
@@ -3542,6 +3744,8 @@
     </w:p>
     <w:p>
       <w:pPr>
+        <w:keepNext/>
+        <w:keepLines/>
         <w:spacing w:after="80" w:before="160"/>
       </w:pPr>
       <w:r>
@@ -3573,6 +3777,9 @@
         <w:gridCol w:w="9026"/>
       </w:tblGrid>
       <w:tr>
+        <w:trPr>
+          <w:cantSplit/>
+        </w:trPr>
         <w:tc>
           <w:tcPr>
             <w:tcW w:type="dxa" w:w="9026"/>
@@ -3619,6 +3826,7 @@
     </w:p>
     <w:p>
       <w:pPr>
+        <w:keepNext/>
         <w:spacing w:after="40" w:before="60"/>
       </w:pPr>
       <w:r>
@@ -3635,6 +3843,7 @@
     <w:p>
       <w:pPr>
         <w:pStyle w:val="Heading1"/>
+        <w:keepNext/>
         <w:pBdr>
           <w:left w:val="single" w:color="3B5BDB" w:sz="24" w:space="12"/>
         </w:pBdr>
@@ -3760,6 +3969,9 @@
         </w:tc>
       </w:tr>
       <w:tr>
+        <w:trPr>
+          <w:cantSplit/>
+        </w:trPr>
         <w:tc>
           <w:tcPr>
             <w:tcW w:type="dxa" w:w="3610"/>
@@ -3843,6 +4055,9 @@
         </w:tc>
       </w:tr>
       <w:tr>
+        <w:trPr>
+          <w:cantSplit/>
+        </w:trPr>
         <w:tc>
           <w:tcPr>
             <w:tcW w:type="dxa" w:w="3610"/>
@@ -3926,6 +4141,9 @@
         </w:tc>
       </w:tr>
       <w:tr>
+        <w:trPr>
+          <w:cantSplit/>
+        </w:trPr>
         <w:tc>
           <w:tcPr>
             <w:tcW w:type="dxa" w:w="3610"/>
@@ -4009,6 +4227,9 @@
         </w:tc>
       </w:tr>
       <w:tr>
+        <w:trPr>
+          <w:cantSplit/>
+        </w:trPr>
         <w:tc>
           <w:tcPr>
             <w:tcW w:type="dxa" w:w="3610"/>

</xml_diff>